<commit_message>
Sync CV date ranges with LinkedIn
Co-Authored-By: Claude Sonnet 4.6 <noreply@anthropic.com>
</commit_message>
<xml_diff>
--- a/K_Walker_CV.docx
+++ b/K_Walker_CV.docx
@@ -1,6 +1,6 @@
 
 <file path=word/document.xml><?xml version="1.0" encoding="utf-8"?>
-<w:document xmlns:wpc="http://schemas.microsoft.com/office/word/2010/wordprocessingCanvas" xmlns:cx="http://schemas.microsoft.com/office/drawing/2014/chartex" xmlns:cx1="http://schemas.microsoft.com/office/drawing/2015/9/8/chartex" xmlns:cx2="http://schemas.microsoft.com/office/drawing/2015/10/21/chartex" xmlns:cx3="http://schemas.microsoft.com/office/drawing/2016/5/9/chartex" xmlns:cx4="http://schemas.microsoft.com/office/drawing/2016/5/10/chartex" xmlns:cx5="http://schemas.microsoft.com/office/drawing/2016/5/11/chartex" xmlns:cx6="http://schemas.microsoft.com/office/drawing/2016/5/12/chartex" xmlns:cx7="http://schemas.microsoft.com/office/drawing/2016/5/13/chartex" xmlns:cx8="http://schemas.microsoft.com/office/drawing/2016/5/14/chartex" xmlns:mc="http://schemas.openxmlformats.org/markup-compatibility/2006" xmlns:aink="http://schemas.microsoft.com/office/drawing/2016/ink" xmlns:am3d="http://schemas.microsoft.com/office/drawing/2017/model3d" xmlns:o="urn:schemas-microsoft-com:office:office" xmlns:oel="http://schemas.microsoft.com/office/2019/extlst" xmlns:r="http://schemas.openxmlformats.org/officeDocument/2006/relationships" xmlns:m="http://schemas.openxmlformats.org/officeDocument/2006/math" xmlns:v="urn:schemas-microsoft-com:vml" xmlns:wp14="http://schemas.microsoft.com/office/word/2010/wordprocessingDrawing" xmlns:wp="http://schemas.openxmlformats.org/drawingml/2006/wordprocessingDrawing" xmlns:w10="urn:schemas-microsoft-com:office:word" xmlns:w="http://schemas.openxmlformats.org/wordprocessingml/2006/main" xmlns:w14="http://schemas.microsoft.com/office/word/2010/wordml" xmlns:w15="http://schemas.microsoft.com/office/word/2012/wordml" xmlns:w16cex="http://schemas.microsoft.com/office/word/2018/wordml/cex" xmlns:w16cid="http://schemas.microsoft.com/office/word/2016/wordml/cid" xmlns:w16="http://schemas.microsoft.com/office/word/2018/wordml" xmlns:w16du="http://schemas.microsoft.com/office/word/2023/wordml/word16du" xmlns:w16sdtdh="http://schemas.microsoft.com/office/word/2020/wordml/sdtdatahash" xmlns:w16sdtfl="http://schemas.microsoft.com/office/word/2024/wordml/sdtformatlock" xmlns:w16se="http://schemas.microsoft.com/office/word/2015/wordml/symex" xmlns:wpg="http://schemas.microsoft.com/office/word/2010/wordprocessingGroup" xmlns:wpi="http://schemas.microsoft.com/office/word/2010/wordprocessingInk" xmlns:wne="http://schemas.microsoft.com/office/word/2006/wordml" xmlns:wps="http://schemas.microsoft.com/office/word/2010/wordprocessingShape" mc:Ignorable="w14 w15 w16se w16cid w16 w16cex w16sdtdh w16sdtfl w16du wp14">
+<w:document xmlns:wpc="http://schemas.microsoft.com/office/word/2010/wordprocessingCanvas" xmlns:cx="http://schemas.microsoft.com/office/drawing/2014/chartex" xmlns:cx1="http://schemas.microsoft.com/office/drawing/2015/9/8/chartex" xmlns:cx2="http://schemas.microsoft.com/office/drawing/2015/10/21/chartex" xmlns:cx3="http://schemas.microsoft.com/office/drawing/2016/5/9/chartex" xmlns:cx4="http://schemas.microsoft.com/office/drawing/2016/5/10/chartex" xmlns:cx5="http://schemas.microsoft.com/office/drawing/2016/5/11/chartex" xmlns:cx6="http://schemas.microsoft.com/office/drawing/2016/5/12/chartex" xmlns:cx7="http://schemas.microsoft.com/office/drawing/2016/5/13/chartex" xmlns:cx8="http://schemas.microsoft.com/office/drawing/2016/5/14/chartex" xmlns:mc="http://schemas.openxmlformats.org/markup-compatibility/2006" xmlns:aink="http://schemas.microsoft.com/office/drawing/2016/ink" xmlns:am3d="http://schemas.microsoft.com/office/drawing/2017/model3d" xmlns:o="urn:schemas-microsoft-com:office:office" xmlns:oel="http://schemas.microsoft.com/office/2019/extlst" xmlns:r="http://schemas.openxmlformats.org/officeDocument/2006/relationships" xmlns:m="http://schemas.openxmlformats.org/officeDocument/2006/math" xmlns:v="urn:schemas-microsoft-com:vml" xmlns:wp14="http://schemas.microsoft.com/office/word/2010/wordprocessingDrawing" xmlns:wp="http://schemas.openxmlformats.org/drawingml/2006/wordprocessingDrawing" xmlns:w10="urn:schemas-microsoft-com:office:word" xmlns:w="http://schemas.openxmlformats.org/wordprocessingml/2006/main" xmlns:w14="http://schemas.microsoft.com/office/word/2010/wordml" xmlns:w15="http://schemas.microsoft.com/office/word/2012/wordml" xmlns:w16cei="http://schemas.microsoft.com/office/word/2026/wordml/cei" xmlns:w16cex="http://schemas.microsoft.com/office/word/2018/wordml/cex" xmlns:w16cid="http://schemas.microsoft.com/office/word/2016/wordml/cid" xmlns:w16="http://schemas.microsoft.com/office/word/2018/wordml" xmlns:w16du="http://schemas.microsoft.com/office/word/2023/wordml/word16du" xmlns:w16sdtdh="http://schemas.microsoft.com/office/word/2020/wordml/sdtdatahash" xmlns:w16sdtfl="http://schemas.microsoft.com/office/word/2024/wordml/sdtformatlock" xmlns:w16se="http://schemas.microsoft.com/office/word/2015/wordml/symex" xmlns:wpg="http://schemas.microsoft.com/office/word/2010/wordprocessingGroup" xmlns:wpi="http://schemas.microsoft.com/office/word/2010/wordprocessingInk" xmlns:wne="http://schemas.microsoft.com/office/word/2006/wordml" xmlns:wps="http://schemas.microsoft.com/office/word/2010/wordprocessingShape" mc:Ignorable="w14 w15 w16se w16cid w16 w16cex w16sdtdh w16sdtfl w16du wp14">
   <w:body>
     <w:p>
       <w:pPr>
@@ -295,21 +295,7 @@
         <w:rPr>
           <w:rFonts w:ascii="Arial Nova" w:hAnsi="Arial Nova" w:cstheme="majorBidi"/>
         </w:rPr>
-        <w:t xml:space="preserve">Providing remote bookkeeping and </w:t>
-      </w:r>
-      <w:proofErr w:type="spellStart"/>
-      <w:r>
-        <w:rPr>
-          <w:rFonts w:ascii="Arial Nova" w:hAnsi="Arial Nova" w:cstheme="majorBidi"/>
-        </w:rPr>
-        <w:t>self assessment</w:t>
-      </w:r>
-      <w:proofErr w:type="spellEnd"/>
-      <w:r>
-        <w:rPr>
-          <w:rFonts w:ascii="Arial Nova" w:hAnsi="Arial Nova" w:cstheme="majorBidi"/>
-        </w:rPr>
-        <w:t xml:space="preserve"> services to individuals and small businesses on a project basis, with a focus on accuracy, Xero, and clean financial records.</w:t>
+        <w:t>Providing remote bookkeeping and self assessment services to individuals and small businesses on a project basis, with a focus on accuracy, Xero, and clean financial records.</w:t>
       </w:r>
     </w:p>
     <w:p>
@@ -347,21 +333,7 @@
         <w:rPr>
           <w:rFonts w:ascii="Arial Nova" w:hAnsi="Arial Nova" w:cstheme="majorBidi"/>
         </w:rPr>
-        <w:t xml:space="preserve">Managing own </w:t>
-      </w:r>
-      <w:proofErr w:type="spellStart"/>
-      <w:r>
-        <w:rPr>
-          <w:rFonts w:ascii="Arial Nova" w:hAnsi="Arial Nova" w:cstheme="majorBidi"/>
-        </w:rPr>
-        <w:t>self assessment</w:t>
-      </w:r>
-      <w:proofErr w:type="spellEnd"/>
-      <w:r>
-        <w:rPr>
-          <w:rFonts w:ascii="Arial Nova" w:hAnsi="Arial Nova" w:cstheme="majorBidi"/>
-        </w:rPr>
-        <w:t>, invoicing, and business administration throughout.</w:t>
+        <w:t>Managing own self assessment, invoicing, and business administration throughout.</w:t>
       </w:r>
     </w:p>
     <w:p>
@@ -473,7 +445,15 @@
           <w:i/>
           <w:iCs/>
         </w:rPr>
-        <w:t xml:space="preserve">January 2025 – </w:t>
+        <w:t>December 2022</w:t>
+      </w:r>
+      <w:r>
+        <w:rPr>
+          <w:rFonts w:ascii="Arial Nova" w:hAnsi="Arial Nova" w:cstheme="majorBidi"/>
+          <w:i/>
+          <w:iCs/>
+        </w:rPr>
+        <w:t xml:space="preserve"> – </w:t>
       </w:r>
       <w:r>
         <w:rPr>
@@ -583,7 +563,15 @@
           <w:i/>
           <w:iCs/>
         </w:rPr>
-        <w:t>June 2021 – December 2024</w:t>
+        <w:t xml:space="preserve">June 2021 – </w:t>
+      </w:r>
+      <w:r>
+        <w:rPr>
+          <w:rFonts w:ascii="Arial Nova" w:hAnsi="Arial Nova" w:cstheme="majorBidi"/>
+          <w:i/>
+          <w:iCs/>
+        </w:rPr>
+        <w:t>December 2022</w:t>
       </w:r>
     </w:p>
     <w:p>
@@ -715,15 +703,15 @@
           <w:i/>
           <w:iCs/>
         </w:rPr>
-        <w:t>March</w:t>
-      </w:r>
-      <w:r>
-        <w:rPr>
-          <w:rFonts w:ascii="Arial Nova" w:hAnsi="Arial Nova" w:cstheme="majorBidi"/>
-          <w:i/>
-          <w:iCs/>
-        </w:rPr>
-        <w:t xml:space="preserve"> 2020 – </w:t>
+        <w:t>February 2020</w:t>
+      </w:r>
+      <w:r>
+        <w:rPr>
+          <w:rFonts w:ascii="Arial Nova" w:hAnsi="Arial Nova" w:cstheme="majorBidi"/>
+          <w:i/>
+          <w:iCs/>
+        </w:rPr>
+        <w:t xml:space="preserve"> – </w:t>
       </w:r>
       <w:r>
         <w:rPr>
@@ -1025,15 +1013,15 @@
           <w:i/>
           <w:iCs/>
         </w:rPr>
-        <w:t xml:space="preserve">September </w:t>
-      </w:r>
-      <w:r>
-        <w:rPr>
-          <w:rFonts w:ascii="Arial Nova" w:hAnsi="Arial Nova" w:cstheme="majorBidi"/>
-          <w:i/>
-          <w:iCs/>
-        </w:rPr>
-        <w:t xml:space="preserve">2017 – </w:t>
+        <w:t>April 2017</w:t>
+      </w:r>
+      <w:r>
+        <w:rPr>
+          <w:rFonts w:ascii="Arial Nova" w:hAnsi="Arial Nova" w:cstheme="majorBidi"/>
+          <w:i/>
+          <w:iCs/>
+        </w:rPr>
+        <w:t xml:space="preserve"> – </w:t>
       </w:r>
       <w:r>
         <w:rPr>
@@ -1227,23 +1215,7 @@
           <w:i/>
           <w:iCs/>
         </w:rPr>
-        <w:t>September</w:t>
-      </w:r>
-      <w:r>
-        <w:rPr>
-          <w:rFonts w:ascii="Arial Nova" w:hAnsi="Arial Nova" w:cstheme="majorBidi"/>
-          <w:i/>
-          <w:iCs/>
-        </w:rPr>
-        <w:t xml:space="preserve"> 201</w:t>
-      </w:r>
-      <w:r>
-        <w:rPr>
-          <w:rFonts w:ascii="Arial Nova" w:hAnsi="Arial Nova" w:cstheme="majorBidi"/>
-          <w:i/>
-          <w:iCs/>
-        </w:rPr>
-        <w:t>5</w:t>
+        <w:t>October 2015</w:t>
       </w:r>
       <w:r>
         <w:rPr>
@@ -1259,15 +1231,7 @@
           <w:i/>
           <w:iCs/>
         </w:rPr>
-        <w:t>January</w:t>
-      </w:r>
-      <w:r>
-        <w:rPr>
-          <w:rFonts w:ascii="Arial Nova" w:hAnsi="Arial Nova" w:cstheme="majorBidi"/>
-          <w:i/>
-          <w:iCs/>
-        </w:rPr>
-        <w:t xml:space="preserve"> 2017</w:t>
+        <w:t>March 2017</w:t>
       </w:r>
     </w:p>
     <w:p>
@@ -2128,7 +2092,7 @@
 </file>
 
 <file path=word/endnotes.xml><?xml version="1.0" encoding="utf-8"?>
-<w:endnotes xmlns:wpc="http://schemas.microsoft.com/office/word/2010/wordprocessingCanvas" xmlns:cx="http://schemas.microsoft.com/office/drawing/2014/chartex" xmlns:cx1="http://schemas.microsoft.com/office/drawing/2015/9/8/chartex" xmlns:cx2="http://schemas.microsoft.com/office/drawing/2015/10/21/chartex" xmlns:cx3="http://schemas.microsoft.com/office/drawing/2016/5/9/chartex" xmlns:cx4="http://schemas.microsoft.com/office/drawing/2016/5/10/chartex" xmlns:cx5="http://schemas.microsoft.com/office/drawing/2016/5/11/chartex" xmlns:cx6="http://schemas.microsoft.com/office/drawing/2016/5/12/chartex" xmlns:cx7="http://schemas.microsoft.com/office/drawing/2016/5/13/chartex" xmlns:cx8="http://schemas.microsoft.com/office/drawing/2016/5/14/chartex" xmlns:mc="http://schemas.openxmlformats.org/markup-compatibility/2006" xmlns:aink="http://schemas.microsoft.com/office/drawing/2016/ink" xmlns:am3d="http://schemas.microsoft.com/office/drawing/2017/model3d" xmlns:o="urn:schemas-microsoft-com:office:office" xmlns:oel="http://schemas.microsoft.com/office/2019/extlst" xmlns:r="http://schemas.openxmlformats.org/officeDocument/2006/relationships" xmlns:m="http://schemas.openxmlformats.org/officeDocument/2006/math" xmlns:v="urn:schemas-microsoft-com:vml" xmlns:wp14="http://schemas.microsoft.com/office/word/2010/wordprocessingDrawing" xmlns:wp="http://schemas.openxmlformats.org/drawingml/2006/wordprocessingDrawing" xmlns:w10="urn:schemas-microsoft-com:office:word" xmlns:w="http://schemas.openxmlformats.org/wordprocessingml/2006/main" xmlns:w14="http://schemas.microsoft.com/office/word/2010/wordml" xmlns:w15="http://schemas.microsoft.com/office/word/2012/wordml" xmlns:w16cex="http://schemas.microsoft.com/office/word/2018/wordml/cex" xmlns:w16cid="http://schemas.microsoft.com/office/word/2016/wordml/cid" xmlns:w16="http://schemas.microsoft.com/office/word/2018/wordml" xmlns:w16du="http://schemas.microsoft.com/office/word/2023/wordml/word16du" xmlns:w16sdtdh="http://schemas.microsoft.com/office/word/2020/wordml/sdtdatahash" xmlns:w16sdtfl="http://schemas.microsoft.com/office/word/2024/wordml/sdtformatlock" xmlns:w16se="http://schemas.microsoft.com/office/word/2015/wordml/symex" xmlns:wpg="http://schemas.microsoft.com/office/word/2010/wordprocessingGroup" xmlns:wpi="http://schemas.microsoft.com/office/word/2010/wordprocessingInk" xmlns:wne="http://schemas.microsoft.com/office/word/2006/wordml" xmlns:wps="http://schemas.microsoft.com/office/word/2010/wordprocessingShape" mc:Ignorable="w14 w15 w16se w16cid w16 w16cex w16sdtdh w16sdtfl w16du wp14">
+<w:endnotes xmlns:wpc="http://schemas.microsoft.com/office/word/2010/wordprocessingCanvas" xmlns:cx="http://schemas.microsoft.com/office/drawing/2014/chartex" xmlns:cx1="http://schemas.microsoft.com/office/drawing/2015/9/8/chartex" xmlns:cx2="http://schemas.microsoft.com/office/drawing/2015/10/21/chartex" xmlns:cx3="http://schemas.microsoft.com/office/drawing/2016/5/9/chartex" xmlns:cx4="http://schemas.microsoft.com/office/drawing/2016/5/10/chartex" xmlns:cx5="http://schemas.microsoft.com/office/drawing/2016/5/11/chartex" xmlns:cx6="http://schemas.microsoft.com/office/drawing/2016/5/12/chartex" xmlns:cx7="http://schemas.microsoft.com/office/drawing/2016/5/13/chartex" xmlns:cx8="http://schemas.microsoft.com/office/drawing/2016/5/14/chartex" xmlns:mc="http://schemas.openxmlformats.org/markup-compatibility/2006" xmlns:aink="http://schemas.microsoft.com/office/drawing/2016/ink" xmlns:am3d="http://schemas.microsoft.com/office/drawing/2017/model3d" xmlns:o="urn:schemas-microsoft-com:office:office" xmlns:oel="http://schemas.microsoft.com/office/2019/extlst" xmlns:r="http://schemas.openxmlformats.org/officeDocument/2006/relationships" xmlns:m="http://schemas.openxmlformats.org/officeDocument/2006/math" xmlns:v="urn:schemas-microsoft-com:vml" xmlns:wp14="http://schemas.microsoft.com/office/word/2010/wordprocessingDrawing" xmlns:wp="http://schemas.openxmlformats.org/drawingml/2006/wordprocessingDrawing" xmlns:w10="urn:schemas-microsoft-com:office:word" xmlns:w="http://schemas.openxmlformats.org/wordprocessingml/2006/main" xmlns:w14="http://schemas.microsoft.com/office/word/2010/wordml" xmlns:w15="http://schemas.microsoft.com/office/word/2012/wordml" xmlns:w16cei="http://schemas.microsoft.com/office/word/2026/wordml/cei" xmlns:w16cex="http://schemas.microsoft.com/office/word/2018/wordml/cex" xmlns:w16cid="http://schemas.microsoft.com/office/word/2016/wordml/cid" xmlns:w16="http://schemas.microsoft.com/office/word/2018/wordml" xmlns:w16du="http://schemas.microsoft.com/office/word/2023/wordml/word16du" xmlns:w16sdtdh="http://schemas.microsoft.com/office/word/2020/wordml/sdtdatahash" xmlns:w16sdtfl="http://schemas.microsoft.com/office/word/2024/wordml/sdtformatlock" xmlns:w16se="http://schemas.microsoft.com/office/word/2015/wordml/symex" xmlns:wpg="http://schemas.microsoft.com/office/word/2010/wordprocessingGroup" xmlns:wpi="http://schemas.microsoft.com/office/word/2010/wordprocessingInk" xmlns:wne="http://schemas.microsoft.com/office/word/2006/wordml" xmlns:wps="http://schemas.microsoft.com/office/word/2010/wordprocessingShape" mc:Ignorable="w14 w15 w16se w16cid w16 w16cex w16sdtdh w16sdtfl w16du wp14">
   <w:endnote w:type="separator" w:id="-1">
     <w:p>
       <w:pPr>
@@ -2153,7 +2117,7 @@
 </file>
 
 <file path=word/footer1.xml><?xml version="1.0" encoding="utf-8"?>
-<w:ftr xmlns:wpc="http://schemas.microsoft.com/office/word/2010/wordprocessingCanvas" xmlns:cx="http://schemas.microsoft.com/office/drawing/2014/chartex" xmlns:cx1="http://schemas.microsoft.com/office/drawing/2015/9/8/chartex" xmlns:cx2="http://schemas.microsoft.com/office/drawing/2015/10/21/chartex" xmlns:cx3="http://schemas.microsoft.com/office/drawing/2016/5/9/chartex" xmlns:cx4="http://schemas.microsoft.com/office/drawing/2016/5/10/chartex" xmlns:cx5="http://schemas.microsoft.com/office/drawing/2016/5/11/chartex" xmlns:cx6="http://schemas.microsoft.com/office/drawing/2016/5/12/chartex" xmlns:cx7="http://schemas.microsoft.com/office/drawing/2016/5/13/chartex" xmlns:cx8="http://schemas.microsoft.com/office/drawing/2016/5/14/chartex" xmlns:mc="http://schemas.openxmlformats.org/markup-compatibility/2006" xmlns:aink="http://schemas.microsoft.com/office/drawing/2016/ink" xmlns:am3d="http://schemas.microsoft.com/office/drawing/2017/model3d" xmlns:o="urn:schemas-microsoft-com:office:office" xmlns:oel="http://schemas.microsoft.com/office/2019/extlst" xmlns:r="http://schemas.openxmlformats.org/officeDocument/2006/relationships" xmlns:m="http://schemas.openxmlformats.org/officeDocument/2006/math" xmlns:v="urn:schemas-microsoft-com:vml" xmlns:wp14="http://schemas.microsoft.com/office/word/2010/wordprocessingDrawing" xmlns:wp="http://schemas.openxmlformats.org/drawingml/2006/wordprocessingDrawing" xmlns:w10="urn:schemas-microsoft-com:office:word" xmlns:w="http://schemas.openxmlformats.org/wordprocessingml/2006/main" xmlns:w14="http://schemas.microsoft.com/office/word/2010/wordml" xmlns:w15="http://schemas.microsoft.com/office/word/2012/wordml" xmlns:w16cex="http://schemas.microsoft.com/office/word/2018/wordml/cex" xmlns:w16cid="http://schemas.microsoft.com/office/word/2016/wordml/cid" xmlns:w16="http://schemas.microsoft.com/office/word/2018/wordml" xmlns:w16du="http://schemas.microsoft.com/office/word/2023/wordml/word16du" xmlns:w16sdtdh="http://schemas.microsoft.com/office/word/2020/wordml/sdtdatahash" xmlns:w16sdtfl="http://schemas.microsoft.com/office/word/2024/wordml/sdtformatlock" xmlns:w16se="http://schemas.microsoft.com/office/word/2015/wordml/symex" xmlns:wpg="http://schemas.microsoft.com/office/word/2010/wordprocessingGroup" xmlns:wpi="http://schemas.microsoft.com/office/word/2010/wordprocessingInk" xmlns:wne="http://schemas.microsoft.com/office/word/2006/wordml" xmlns:wps="http://schemas.microsoft.com/office/word/2010/wordprocessingShape" mc:Ignorable="w14 w15 w16se w16cid w16 w16cex w16sdtdh w16sdtfl w16du wp14">
+<w:ftr xmlns:wpc="http://schemas.microsoft.com/office/word/2010/wordprocessingCanvas" xmlns:cx="http://schemas.microsoft.com/office/drawing/2014/chartex" xmlns:cx1="http://schemas.microsoft.com/office/drawing/2015/9/8/chartex" xmlns:cx2="http://schemas.microsoft.com/office/drawing/2015/10/21/chartex" xmlns:cx3="http://schemas.microsoft.com/office/drawing/2016/5/9/chartex" xmlns:cx4="http://schemas.microsoft.com/office/drawing/2016/5/10/chartex" xmlns:cx5="http://schemas.microsoft.com/office/drawing/2016/5/11/chartex" xmlns:cx6="http://schemas.microsoft.com/office/drawing/2016/5/12/chartex" xmlns:cx7="http://schemas.microsoft.com/office/drawing/2016/5/13/chartex" xmlns:cx8="http://schemas.microsoft.com/office/drawing/2016/5/14/chartex" xmlns:mc="http://schemas.openxmlformats.org/markup-compatibility/2006" xmlns:aink="http://schemas.microsoft.com/office/drawing/2016/ink" xmlns:am3d="http://schemas.microsoft.com/office/drawing/2017/model3d" xmlns:o="urn:schemas-microsoft-com:office:office" xmlns:oel="http://schemas.microsoft.com/office/2019/extlst" xmlns:r="http://schemas.openxmlformats.org/officeDocument/2006/relationships" xmlns:m="http://schemas.openxmlformats.org/officeDocument/2006/math" xmlns:v="urn:schemas-microsoft-com:vml" xmlns:wp14="http://schemas.microsoft.com/office/word/2010/wordprocessingDrawing" xmlns:wp="http://schemas.openxmlformats.org/drawingml/2006/wordprocessingDrawing" xmlns:w10="urn:schemas-microsoft-com:office:word" xmlns:w="http://schemas.openxmlformats.org/wordprocessingml/2006/main" xmlns:w14="http://schemas.microsoft.com/office/word/2010/wordml" xmlns:w15="http://schemas.microsoft.com/office/word/2012/wordml" xmlns:w16cei="http://schemas.microsoft.com/office/word/2026/wordml/cei" xmlns:w16cex="http://schemas.microsoft.com/office/word/2018/wordml/cex" xmlns:w16cid="http://schemas.microsoft.com/office/word/2016/wordml/cid" xmlns:w16="http://schemas.microsoft.com/office/word/2018/wordml" xmlns:w16du="http://schemas.microsoft.com/office/word/2023/wordml/word16du" xmlns:w16sdtdh="http://schemas.microsoft.com/office/word/2020/wordml/sdtdatahash" xmlns:w16sdtfl="http://schemas.microsoft.com/office/word/2024/wordml/sdtformatlock" xmlns:w16se="http://schemas.microsoft.com/office/word/2015/wordml/symex" xmlns:wpg="http://schemas.microsoft.com/office/word/2010/wordprocessingGroup" xmlns:wpi="http://schemas.microsoft.com/office/word/2010/wordprocessingInk" xmlns:wne="http://schemas.microsoft.com/office/word/2006/wordml" xmlns:wps="http://schemas.microsoft.com/office/word/2010/wordprocessingShape" mc:Ignorable="w14 w15 w16se w16cid w16 w16cex w16sdtdh w16sdtfl w16du wp14">
   <w:p>
     <w:pPr>
       <w:pStyle w:val="Footer"/>
@@ -2309,7 +2273,7 @@
 </file>
 
 <file path=word/footnotes.xml><?xml version="1.0" encoding="utf-8"?>
-<w:footnotes xmlns:wpc="http://schemas.microsoft.com/office/word/2010/wordprocessingCanvas" xmlns:cx="http://schemas.microsoft.com/office/drawing/2014/chartex" xmlns:cx1="http://schemas.microsoft.com/office/drawing/2015/9/8/chartex" xmlns:cx2="http://schemas.microsoft.com/office/drawing/2015/10/21/chartex" xmlns:cx3="http://schemas.microsoft.com/office/drawing/2016/5/9/chartex" xmlns:cx4="http://schemas.microsoft.com/office/drawing/2016/5/10/chartex" xmlns:cx5="http://schemas.microsoft.com/office/drawing/2016/5/11/chartex" xmlns:cx6="http://schemas.microsoft.com/office/drawing/2016/5/12/chartex" xmlns:cx7="http://schemas.microsoft.com/office/drawing/2016/5/13/chartex" xmlns:cx8="http://schemas.microsoft.com/office/drawing/2016/5/14/chartex" xmlns:mc="http://schemas.openxmlformats.org/markup-compatibility/2006" xmlns:aink="http://schemas.microsoft.com/office/drawing/2016/ink" xmlns:am3d="http://schemas.microsoft.com/office/drawing/2017/model3d" xmlns:o="urn:schemas-microsoft-com:office:office" xmlns:oel="http://schemas.microsoft.com/office/2019/extlst" xmlns:r="http://schemas.openxmlformats.org/officeDocument/2006/relationships" xmlns:m="http://schemas.openxmlformats.org/officeDocument/2006/math" xmlns:v="urn:schemas-microsoft-com:vml" xmlns:wp14="http://schemas.microsoft.com/office/word/2010/wordprocessingDrawing" xmlns:wp="http://schemas.openxmlformats.org/drawingml/2006/wordprocessingDrawing" xmlns:w10="urn:schemas-microsoft-com:office:word" xmlns:w="http://schemas.openxmlformats.org/wordprocessingml/2006/main" xmlns:w14="http://schemas.microsoft.com/office/word/2010/wordml" xmlns:w15="http://schemas.microsoft.com/office/word/2012/wordml" xmlns:w16cex="http://schemas.microsoft.com/office/word/2018/wordml/cex" xmlns:w16cid="http://schemas.microsoft.com/office/word/2016/wordml/cid" xmlns:w16="http://schemas.microsoft.com/office/word/2018/wordml" xmlns:w16du="http://schemas.microsoft.com/office/word/2023/wordml/word16du" xmlns:w16sdtdh="http://schemas.microsoft.com/office/word/2020/wordml/sdtdatahash" xmlns:w16sdtfl="http://schemas.microsoft.com/office/word/2024/wordml/sdtformatlock" xmlns:w16se="http://schemas.microsoft.com/office/word/2015/wordml/symex" xmlns:wpg="http://schemas.microsoft.com/office/word/2010/wordprocessingGroup" xmlns:wpi="http://schemas.microsoft.com/office/word/2010/wordprocessingInk" xmlns:wne="http://schemas.microsoft.com/office/word/2006/wordml" xmlns:wps="http://schemas.microsoft.com/office/word/2010/wordprocessingShape" mc:Ignorable="w14 w15 w16se w16cid w16 w16cex w16sdtdh w16sdtfl w16du wp14">
+<w:footnotes xmlns:wpc="http://schemas.microsoft.com/office/word/2010/wordprocessingCanvas" xmlns:cx="http://schemas.microsoft.com/office/drawing/2014/chartex" xmlns:cx1="http://schemas.microsoft.com/office/drawing/2015/9/8/chartex" xmlns:cx2="http://schemas.microsoft.com/office/drawing/2015/10/21/chartex" xmlns:cx3="http://schemas.microsoft.com/office/drawing/2016/5/9/chartex" xmlns:cx4="http://schemas.microsoft.com/office/drawing/2016/5/10/chartex" xmlns:cx5="http://schemas.microsoft.com/office/drawing/2016/5/11/chartex" xmlns:cx6="http://schemas.microsoft.com/office/drawing/2016/5/12/chartex" xmlns:cx7="http://schemas.microsoft.com/office/drawing/2016/5/13/chartex" xmlns:cx8="http://schemas.microsoft.com/office/drawing/2016/5/14/chartex" xmlns:mc="http://schemas.openxmlformats.org/markup-compatibility/2006" xmlns:aink="http://schemas.microsoft.com/office/drawing/2016/ink" xmlns:am3d="http://schemas.microsoft.com/office/drawing/2017/model3d" xmlns:o="urn:schemas-microsoft-com:office:office" xmlns:oel="http://schemas.microsoft.com/office/2019/extlst" xmlns:r="http://schemas.openxmlformats.org/officeDocument/2006/relationships" xmlns:m="http://schemas.openxmlformats.org/officeDocument/2006/math" xmlns:v="urn:schemas-microsoft-com:vml" xmlns:wp14="http://schemas.microsoft.com/office/word/2010/wordprocessingDrawing" xmlns:wp="http://schemas.openxmlformats.org/drawingml/2006/wordprocessingDrawing" xmlns:w10="urn:schemas-microsoft-com:office:word" xmlns:w="http://schemas.openxmlformats.org/wordprocessingml/2006/main" xmlns:w14="http://schemas.microsoft.com/office/word/2010/wordml" xmlns:w15="http://schemas.microsoft.com/office/word/2012/wordml" xmlns:w16cei="http://schemas.microsoft.com/office/word/2026/wordml/cei" xmlns:w16cex="http://schemas.microsoft.com/office/word/2018/wordml/cex" xmlns:w16cid="http://schemas.microsoft.com/office/word/2016/wordml/cid" xmlns:w16="http://schemas.microsoft.com/office/word/2018/wordml" xmlns:w16du="http://schemas.microsoft.com/office/word/2023/wordml/word16du" xmlns:w16sdtdh="http://schemas.microsoft.com/office/word/2020/wordml/sdtdatahash" xmlns:w16sdtfl="http://schemas.microsoft.com/office/word/2024/wordml/sdtformatlock" xmlns:w16se="http://schemas.microsoft.com/office/word/2015/wordml/symex" xmlns:wpg="http://schemas.microsoft.com/office/word/2010/wordprocessingGroup" xmlns:wpi="http://schemas.microsoft.com/office/word/2010/wordprocessingInk" xmlns:wne="http://schemas.microsoft.com/office/word/2006/wordml" xmlns:wps="http://schemas.microsoft.com/office/word/2010/wordprocessingShape" mc:Ignorable="w14 w15 w16se w16cid w16 w16cex w16sdtdh w16sdtfl w16du wp14">
   <w:footnote w:type="separator" w:id="-1">
     <w:p>
       <w:pPr>
@@ -2334,7 +2298,7 @@
 </file>
 
 <file path=word/header1.xml><?xml version="1.0" encoding="utf-8"?>
-<w:hdr xmlns:wpc="http://schemas.microsoft.com/office/word/2010/wordprocessingCanvas" xmlns:cx="http://schemas.microsoft.com/office/drawing/2014/chartex" xmlns:cx1="http://schemas.microsoft.com/office/drawing/2015/9/8/chartex" xmlns:cx2="http://schemas.microsoft.com/office/drawing/2015/10/21/chartex" xmlns:cx3="http://schemas.microsoft.com/office/drawing/2016/5/9/chartex" xmlns:cx4="http://schemas.microsoft.com/office/drawing/2016/5/10/chartex" xmlns:cx5="http://schemas.microsoft.com/office/drawing/2016/5/11/chartex" xmlns:cx6="http://schemas.microsoft.com/office/drawing/2016/5/12/chartex" xmlns:cx7="http://schemas.microsoft.com/office/drawing/2016/5/13/chartex" xmlns:cx8="http://schemas.microsoft.com/office/drawing/2016/5/14/chartex" xmlns:mc="http://schemas.openxmlformats.org/markup-compatibility/2006" xmlns:aink="http://schemas.microsoft.com/office/drawing/2016/ink" xmlns:am3d="http://schemas.microsoft.com/office/drawing/2017/model3d" xmlns:o="urn:schemas-microsoft-com:office:office" xmlns:oel="http://schemas.microsoft.com/office/2019/extlst" xmlns:r="http://schemas.openxmlformats.org/officeDocument/2006/relationships" xmlns:m="http://schemas.openxmlformats.org/officeDocument/2006/math" xmlns:v="urn:schemas-microsoft-com:vml" xmlns:wp14="http://schemas.microsoft.com/office/word/2010/wordprocessingDrawing" xmlns:wp="http://schemas.openxmlformats.org/drawingml/2006/wordprocessingDrawing" xmlns:w10="urn:schemas-microsoft-com:office:word" xmlns:w="http://schemas.openxmlformats.org/wordprocessingml/2006/main" xmlns:w14="http://schemas.microsoft.com/office/word/2010/wordml" xmlns:w15="http://schemas.microsoft.com/office/word/2012/wordml" xmlns:w16cex="http://schemas.microsoft.com/office/word/2018/wordml/cex" xmlns:w16cid="http://schemas.microsoft.com/office/word/2016/wordml/cid" xmlns:w16="http://schemas.microsoft.com/office/word/2018/wordml" xmlns:w16du="http://schemas.microsoft.com/office/word/2023/wordml/word16du" xmlns:w16sdtdh="http://schemas.microsoft.com/office/word/2020/wordml/sdtdatahash" xmlns:w16sdtfl="http://schemas.microsoft.com/office/word/2024/wordml/sdtformatlock" xmlns:w16se="http://schemas.microsoft.com/office/word/2015/wordml/symex" xmlns:wpg="http://schemas.microsoft.com/office/word/2010/wordprocessingGroup" xmlns:wpi="http://schemas.microsoft.com/office/word/2010/wordprocessingInk" xmlns:wne="http://schemas.microsoft.com/office/word/2006/wordml" xmlns:wps="http://schemas.microsoft.com/office/word/2010/wordprocessingShape" mc:Ignorable="w14 w15 w16se w16cid w16 w16cex w16sdtdh w16sdtfl w16du wp14">
+<w:hdr xmlns:wpc="http://schemas.microsoft.com/office/word/2010/wordprocessingCanvas" xmlns:cx="http://schemas.microsoft.com/office/drawing/2014/chartex" xmlns:cx1="http://schemas.microsoft.com/office/drawing/2015/9/8/chartex" xmlns:cx2="http://schemas.microsoft.com/office/drawing/2015/10/21/chartex" xmlns:cx3="http://schemas.microsoft.com/office/drawing/2016/5/9/chartex" xmlns:cx4="http://schemas.microsoft.com/office/drawing/2016/5/10/chartex" xmlns:cx5="http://schemas.microsoft.com/office/drawing/2016/5/11/chartex" xmlns:cx6="http://schemas.microsoft.com/office/drawing/2016/5/12/chartex" xmlns:cx7="http://schemas.microsoft.com/office/drawing/2016/5/13/chartex" xmlns:cx8="http://schemas.microsoft.com/office/drawing/2016/5/14/chartex" xmlns:mc="http://schemas.openxmlformats.org/markup-compatibility/2006" xmlns:aink="http://schemas.microsoft.com/office/drawing/2016/ink" xmlns:am3d="http://schemas.microsoft.com/office/drawing/2017/model3d" xmlns:o="urn:schemas-microsoft-com:office:office" xmlns:oel="http://schemas.microsoft.com/office/2019/extlst" xmlns:r="http://schemas.openxmlformats.org/officeDocument/2006/relationships" xmlns:m="http://schemas.openxmlformats.org/officeDocument/2006/math" xmlns:v="urn:schemas-microsoft-com:vml" xmlns:wp14="http://schemas.microsoft.com/office/word/2010/wordprocessingDrawing" xmlns:wp="http://schemas.openxmlformats.org/drawingml/2006/wordprocessingDrawing" xmlns:w10="urn:schemas-microsoft-com:office:word" xmlns:w="http://schemas.openxmlformats.org/wordprocessingml/2006/main" xmlns:w14="http://schemas.microsoft.com/office/word/2010/wordml" xmlns:w15="http://schemas.microsoft.com/office/word/2012/wordml" xmlns:w16cei="http://schemas.microsoft.com/office/word/2026/wordml/cei" xmlns:w16cex="http://schemas.microsoft.com/office/word/2018/wordml/cex" xmlns:w16cid="http://schemas.microsoft.com/office/word/2016/wordml/cid" xmlns:w16="http://schemas.microsoft.com/office/word/2018/wordml" xmlns:w16du="http://schemas.microsoft.com/office/word/2023/wordml/word16du" xmlns:w16sdtdh="http://schemas.microsoft.com/office/word/2020/wordml/sdtdatahash" xmlns:w16sdtfl="http://schemas.microsoft.com/office/word/2024/wordml/sdtformatlock" xmlns:w16se="http://schemas.microsoft.com/office/word/2015/wordml/symex" xmlns:wpg="http://schemas.microsoft.com/office/word/2010/wordprocessingGroup" xmlns:wpi="http://schemas.microsoft.com/office/word/2010/wordprocessingInk" xmlns:wne="http://schemas.microsoft.com/office/word/2006/wordml" xmlns:wps="http://schemas.microsoft.com/office/word/2010/wordprocessingShape" mc:Ignorable="w14 w15 w16se w16cid w16 w16cex w16sdtdh w16sdtfl w16du wp14">
   <w:p>
     <w:pPr>
       <w:spacing w:after="0" w:line="240" w:lineRule="auto"/>
@@ -2405,7 +2369,7 @@
 </file>
 
 <file path=word/numbering.xml><?xml version="1.0" encoding="utf-8"?>
-<w:numbering xmlns:wpc="http://schemas.microsoft.com/office/word/2010/wordprocessingCanvas" xmlns:cx="http://schemas.microsoft.com/office/drawing/2014/chartex" xmlns:cx1="http://schemas.microsoft.com/office/drawing/2015/9/8/chartex" xmlns:cx2="http://schemas.microsoft.com/office/drawing/2015/10/21/chartex" xmlns:cx3="http://schemas.microsoft.com/office/drawing/2016/5/9/chartex" xmlns:cx4="http://schemas.microsoft.com/office/drawing/2016/5/10/chartex" xmlns:cx5="http://schemas.microsoft.com/office/drawing/2016/5/11/chartex" xmlns:cx6="http://schemas.microsoft.com/office/drawing/2016/5/12/chartex" xmlns:cx7="http://schemas.microsoft.com/office/drawing/2016/5/13/chartex" xmlns:cx8="http://schemas.microsoft.com/office/drawing/2016/5/14/chartex" xmlns:mc="http://schemas.openxmlformats.org/markup-compatibility/2006" xmlns:aink="http://schemas.microsoft.com/office/drawing/2016/ink" xmlns:am3d="http://schemas.microsoft.com/office/drawing/2017/model3d" xmlns:o="urn:schemas-microsoft-com:office:office" xmlns:oel="http://schemas.microsoft.com/office/2019/extlst" xmlns:r="http://schemas.openxmlformats.org/officeDocument/2006/relationships" xmlns:m="http://schemas.openxmlformats.org/officeDocument/2006/math" xmlns:v="urn:schemas-microsoft-com:vml" xmlns:wp14="http://schemas.microsoft.com/office/word/2010/wordprocessingDrawing" xmlns:wp="http://schemas.openxmlformats.org/drawingml/2006/wordprocessingDrawing" xmlns:w10="urn:schemas-microsoft-com:office:word" xmlns:w="http://schemas.openxmlformats.org/wordprocessingml/2006/main" xmlns:w14="http://schemas.microsoft.com/office/word/2010/wordml" xmlns:w15="http://schemas.microsoft.com/office/word/2012/wordml" xmlns:w16cex="http://schemas.microsoft.com/office/word/2018/wordml/cex" xmlns:w16cid="http://schemas.microsoft.com/office/word/2016/wordml/cid" xmlns:w16="http://schemas.microsoft.com/office/word/2018/wordml" xmlns:w16du="http://schemas.microsoft.com/office/word/2023/wordml/word16du" xmlns:w16sdtdh="http://schemas.microsoft.com/office/word/2020/wordml/sdtdatahash" xmlns:w16sdtfl="http://schemas.microsoft.com/office/word/2024/wordml/sdtformatlock" xmlns:w16se="http://schemas.microsoft.com/office/word/2015/wordml/symex" xmlns:wpg="http://schemas.microsoft.com/office/word/2010/wordprocessingGroup" xmlns:wpi="http://schemas.microsoft.com/office/word/2010/wordprocessingInk" xmlns:wne="http://schemas.microsoft.com/office/word/2006/wordml" xmlns:wps="http://schemas.microsoft.com/office/word/2010/wordprocessingShape" mc:Ignorable="w14 w15 w16se w16cid w16 w16cex w16sdtdh w16sdtfl w16du wp14">
+<w:numbering xmlns:wpc="http://schemas.microsoft.com/office/word/2010/wordprocessingCanvas" xmlns:cx="http://schemas.microsoft.com/office/drawing/2014/chartex" xmlns:cx1="http://schemas.microsoft.com/office/drawing/2015/9/8/chartex" xmlns:cx2="http://schemas.microsoft.com/office/drawing/2015/10/21/chartex" xmlns:cx3="http://schemas.microsoft.com/office/drawing/2016/5/9/chartex" xmlns:cx4="http://schemas.microsoft.com/office/drawing/2016/5/10/chartex" xmlns:cx5="http://schemas.microsoft.com/office/drawing/2016/5/11/chartex" xmlns:cx6="http://schemas.microsoft.com/office/drawing/2016/5/12/chartex" xmlns:cx7="http://schemas.microsoft.com/office/drawing/2016/5/13/chartex" xmlns:cx8="http://schemas.microsoft.com/office/drawing/2016/5/14/chartex" xmlns:mc="http://schemas.openxmlformats.org/markup-compatibility/2006" xmlns:aink="http://schemas.microsoft.com/office/drawing/2016/ink" xmlns:am3d="http://schemas.microsoft.com/office/drawing/2017/model3d" xmlns:o="urn:schemas-microsoft-com:office:office" xmlns:oel="http://schemas.microsoft.com/office/2019/extlst" xmlns:r="http://schemas.openxmlformats.org/officeDocument/2006/relationships" xmlns:m="http://schemas.openxmlformats.org/officeDocument/2006/math" xmlns:v="urn:schemas-microsoft-com:vml" xmlns:wp14="http://schemas.microsoft.com/office/word/2010/wordprocessingDrawing" xmlns:wp="http://schemas.openxmlformats.org/drawingml/2006/wordprocessingDrawing" xmlns:w10="urn:schemas-microsoft-com:office:word" xmlns:w="http://schemas.openxmlformats.org/wordprocessingml/2006/main" xmlns:w14="http://schemas.microsoft.com/office/word/2010/wordml" xmlns:w15="http://schemas.microsoft.com/office/word/2012/wordml" xmlns:w16cei="http://schemas.microsoft.com/office/word/2026/wordml/cei" xmlns:w16cex="http://schemas.microsoft.com/office/word/2018/wordml/cex" xmlns:w16cid="http://schemas.microsoft.com/office/word/2016/wordml/cid" xmlns:w16="http://schemas.microsoft.com/office/word/2018/wordml" xmlns:w16du="http://schemas.microsoft.com/office/word/2023/wordml/word16du" xmlns:w16sdtdh="http://schemas.microsoft.com/office/word/2020/wordml/sdtdatahash" xmlns:w16sdtfl="http://schemas.microsoft.com/office/word/2024/wordml/sdtformatlock" xmlns:w16se="http://schemas.microsoft.com/office/word/2015/wordml/symex" xmlns:wpg="http://schemas.microsoft.com/office/word/2010/wordprocessingGroup" xmlns:wpi="http://schemas.microsoft.com/office/word/2010/wordprocessingInk" xmlns:wne="http://schemas.microsoft.com/office/word/2006/wordml" xmlns:wps="http://schemas.microsoft.com/office/word/2010/wordprocessingShape" mc:Ignorable="w14 w15 w16se w16cid w16 w16cex w16sdtdh w16sdtfl w16du wp14">
   <w:numPicBullet w:numPicBulletId="0">
     <w:pict>
       <v:rect id="_x0000_i1025" style="width:0;height:1.5pt" o:hralign="center" o:bullet="t" o:hrstd="t" o:hr="t" fillcolor="#a0a0a0" stroked="f"/>

</xml_diff>